<commit_message>
refactor: apply round 3 peer-review fixes; wrap 25 equations in Word Math (m:oMath); align Table 4/6 notes, seeds, and complexity; purge obsolete JEAS files
</commit_message>
<xml_diff>
--- a/COVER_LETTER_ELECTRICAL_ENGINEERING.docx
+++ b/COVER_LETTER_ELECTRICAL_ENGINEERING.docx
@@ -4,7 +4,8 @@
   <w:body>
     <w:p>
       <w:pPr>
-        <w:spacing w:before="0" w:after="85"/>
+        <w:spacing w:before="0" w:after="240"/>
+        <w:jc w:val="left"/>
       </w:pPr>
       <w:r>
         <w:rPr>
@@ -18,7 +19,8 @@
     </w:p>
     <w:p>
       <w:pPr>
-        <w:spacing w:before="0" w:after="40"/>
+        <w:spacing w:before="0" w:after="80"/>
+        <w:jc w:val="left"/>
       </w:pPr>
       <w:r>
         <w:rPr>
@@ -32,7 +34,8 @@
     </w:p>
     <w:p>
       <w:pPr>
-        <w:spacing w:before="0" w:after="20"/>
+        <w:spacing w:before="0" w:after="40"/>
+        <w:jc w:val="left"/>
       </w:pPr>
       <w:r>
         <w:rPr>
@@ -46,7 +49,8 @@
     </w:p>
     <w:p>
       <w:pPr>
-        <w:spacing w:before="0" w:after="85"/>
+        <w:spacing w:before="0" w:after="40"/>
+        <w:jc w:val="left"/>
       </w:pPr>
       <w:r>
         <w:rPr>
@@ -55,12 +59,27 @@
           <w:i/>
           <w:sz w:val="22"/>
         </w:rPr>
-        <w:t>Electrical Engineering (Archiv für Elektrotechnik), Faculty of Electrical Engineering and Computing, University of Zagreb, Croatia</w:t>
+        <w:t>Electrical Engineering (Archiv für Elektrotechnik)</w:t>
       </w:r>
     </w:p>
     <w:p>
       <w:pPr>
-        <w:spacing w:before="0" w:after="100"/>
+        <w:spacing w:before="0" w:after="200"/>
+        <w:jc w:val="left"/>
+      </w:pPr>
+      <w:r>
+        <w:rPr>
+          <w:rFonts w:ascii="Times New Roman" w:hAnsi="Times New Roman"/>
+          <w:b w:val="0"/>
+          <w:i w:val="0"/>
+          <w:sz w:val="22"/>
+        </w:rPr>
+        <w:t>Faculty of Electrical Engineering and Computing, University of Zagreb, Croatia</w:t>
+      </w:r>
+    </w:p>
+    <w:p>
+      <w:pPr>
+        <w:spacing w:before="0" w:after="240"/>
       </w:pPr>
       <w:r>
         <w:rPr>
@@ -73,6 +92,7 @@
       <w:r>
         <w:rPr>
           <w:rFonts w:ascii="Times New Roman" w:hAnsi="Times New Roman"/>
+          <w:b w:val="0"/>
           <w:sz w:val="22"/>
         </w:rPr>
         <w:t>Submission of Original Research Article — “PSO-TCWavKAN: A Swarm-Optimized Temporal Convolutional Wavelet Kolmogorov-Arnold Network with Multi-Kernel Trend Decomposition and Asymptotic Linear Structural Recovery for Resilient Power Transformer Thermal Dynamics Forecasting”</w:t>
@@ -80,7 +100,8 @@
     </w:p>
     <w:p>
       <w:pPr>
-        <w:spacing w:before="0" w:after="85"/>
+        <w:spacing w:before="0" w:after="160"/>
+        <w:jc w:val="left"/>
       </w:pPr>
       <w:r>
         <w:rPr>
@@ -94,7 +115,8 @@
     </w:p>
     <w:p>
       <w:pPr>
-        <w:spacing w:before="0" w:after="85"/>
+        <w:spacing w:before="0" w:after="160"/>
+        <w:jc w:val="left"/>
       </w:pPr>
       <w:r>
         <w:rPr>
@@ -103,12 +125,26 @@
           <w:i w:val="0"/>
           <w:sz w:val="22"/>
         </w:rPr>
-        <w:t>I respectfully submit the above-titled original research manuscript for consideration as an Original Research Paper in Electrical Engineering (Archiv für Elektrotechnik). This work addresses a critical operational challenge in power system asset management: accurate multi-step thermal dynamics forecasting for high-voltage mineral-oil-immersed power transformers, directly relevant to substation dynamic thermal rating (DTR), IEC 60076-7 thermal overrun prevention, and condition-based maintenance.</w:t>
+        <w:t>I respectfully submit the above-titled original research manuscript for consideration as an Original Research Paper in Electrical Engineering (Archiv für Elektrotechnik). This work presents PSO-TCWavKAN, a swarm-optimized temporal convolutional wavelet Kolmogorov-Arnold network for resilient multi-step thermal dynamics forecasting of high-voltage mineral-oil-immersed power transformers, directly applicable to substation dynamic thermal rating (DTR), condition-based asset management, and IEC 60076-7 / IEEE Std C57.91 thermal overrun prevention.</w:t>
       </w:r>
     </w:p>
     <w:p>
       <w:pPr>
-        <w:spacing w:before="0" w:after="85"/>
+        <w:spacing w:before="200" w:after="80"/>
+      </w:pPr>
+      <w:r>
+        <w:rPr>
+          <w:rFonts w:ascii="Times New Roman" w:hAnsi="Times New Roman"/>
+          <w:b/>
+          <w:sz w:val="24"/>
+        </w:rPr>
+        <w:t>Alignment with the Scope of Electrical Engineering</w:t>
+      </w:r>
+    </w:p>
+    <w:p>
+      <w:pPr>
+        <w:spacing w:before="0" w:after="120"/>
+        <w:jc w:val="left"/>
       </w:pPr>
       <w:r>
         <w:rPr>
@@ -117,12 +153,191 @@
           <w:i w:val="0"/>
           <w:sz w:val="22"/>
         </w:rPr>
-        <w:t>This manuscript directly builds upon the seminal contribution published in this journal — Bezerra et al. (2024), “A forecasting methodology based on second-generation wavelets and neural networks: application to power transformer oil temperature” (Electr Eng, Vol. 106, pp. 3017–3029, DOI: 10.1007/s00202-023-02134-5) — and proposes three orthogonal advances: (i) continuous dyadic Morlet wavelet filter banks embedded in Kolmogorov-Arnold Network edges; (ii) an asymptotic linear structural recovery property (Proposition 1) guaranteeing the hypothesis space contains a linear subspace, ensuring structural expressivity; and (iii) a Modified PSO with Comprehensive Learning Exemplar (MPSOCL) warm-start bypassing non-convex wavelet ripple traps prior to AdamW fine-tuning and Stochastic Weight Averaging.</w:t>
+        <w:t>This manuscript addresses transformer thermal dynamics forecasting — a topic of longstanding central interest to this journal. Our work directly builds upon and substantially advances the seminal contribution by Bezerra et al. (2024), “A forecasting methodology based on second-generation wavelets and neural networks: application to power transformer oil temperature” (Electr Eng, Vol. 106, Issue 3, pp. 3017–3029, DOI: 10.1007/s00202-023-02134-5), published in this very journal. While Bezerra et al. demonstrated the efficacy of discrete second-generation wavelets with traditional MLPs, our work establishes the next evolutionary leap via three orthogonal innovations:</w:t>
       </w:r>
     </w:p>
     <w:p>
       <w:pPr>
-        <w:spacing w:before="0" w:after="85"/>
+        <w:pStyle w:val="ListBullet"/>
+        <w:spacing w:after="80"/>
+        <w:ind w:left="360"/>
+      </w:pPr>
+      <w:r>
+        <w:rPr>
+          <w:rFonts w:ascii="Times New Roman" w:hAnsi="Times New Roman"/>
+          <w:sz w:val="22"/>
+        </w:rPr>
+        <w:t>(1) Continuous Dyadic Morlet Wavelet Filter Banks embedded in Kolmogorov-Arnold Network edges — eliminating discrete boundary artifacts and the B-spline Grid Update Dilemma;</w:t>
+      </w:r>
+    </w:p>
+    <w:p>
+      <w:pPr>
+        <w:pStyle w:val="ListBullet"/>
+        <w:spacing w:after="80"/>
+        <w:ind w:left="360"/>
+      </w:pPr>
+      <w:r>
+        <w:rPr>
+          <w:rFonts w:ascii="Times New Roman" w:hAnsi="Times New Roman"/>
+          <w:sz w:val="22"/>
+        </w:rPr>
+        <w:t>(2) Asymptotic Linear Recovery Guarantee (Proposition 1) — a topological closure proof ensuring the architecture structurally recovers canonical DLinear projections in the boundary limit, preventing non-linear overfitting collapse;</w:t>
+      </w:r>
+    </w:p>
+    <w:p>
+      <w:pPr>
+        <w:pStyle w:val="ListBullet"/>
+        <w:spacing w:after="80"/>
+        <w:ind w:left="360"/>
+      </w:pPr>
+      <w:r>
+        <w:rPr>
+          <w:rFonts w:ascii="Times New Roman" w:hAnsi="Times New Roman"/>
+          <w:sz w:val="22"/>
+        </w:rPr>
+        <w:t>(3) Comprehensive Learning Particle Swarm Optimization (CLPSO) warm-start — bypassing non-convex wavelet ripple traps via a 4-D swarm prior to AdamW fine-tuning and Stochastic Weight Averaging.</w:t>
+      </w:r>
+    </w:p>
+    <w:p>
+      <w:pPr>
+        <w:spacing w:before="200" w:after="80"/>
+      </w:pPr>
+      <w:r>
+        <w:rPr>
+          <w:rFonts w:ascii="Times New Roman" w:hAnsi="Times New Roman"/>
+          <w:b/>
+          <w:sz w:val="24"/>
+        </w:rPr>
+        <w:t>Summary of Scientific Contributions</w:t>
+      </w:r>
+    </w:p>
+    <w:p>
+      <w:pPr>
+        <w:spacing w:before="40" w:after="80"/>
+        <w:ind w:left="0"/>
+      </w:pPr>
+      <w:r>
+        <w:rPr>
+          <w:rFonts w:ascii="Times New Roman" w:hAnsi="Times New Roman"/>
+          <w:b/>
+          <w:sz w:val="22"/>
+        </w:rPr>
+        <w:t>Theoretical Rigor:</w:t>
+      </w:r>
+      <w:r>
+        <w:rPr>
+          <w:rFonts w:ascii="Times New Roman" w:hAnsi="Times New Roman"/>
+          <w:b w:val="0"/>
+          <w:sz w:val="22"/>
+        </w:rPr>
+        <w:t xml:space="preserve"> Proposition 1 provides a strict topological closure proof guaranteeing the hypothesis space contains the optimal linear solution as a boundary element — a mathematically novel contribution for KAN-based engineering forecasting.</w:t>
+      </w:r>
+    </w:p>
+    <w:p>
+      <w:pPr>
+        <w:spacing w:before="40" w:after="80"/>
+        <w:ind w:left="0"/>
+      </w:pPr>
+      <w:r>
+        <w:rPr>
+          <w:rFonts w:ascii="Times New Roman" w:hAnsi="Times New Roman"/>
+          <w:b/>
+          <w:sz w:val="22"/>
+        </w:rPr>
+        <w:t>Exhaustive Empirical Validation:</w:t>
+      </w:r>
+      <w:r>
+        <w:rPr>
+          <w:rFonts w:ascii="Times New Roman" w:hAnsi="Times New Roman"/>
+          <w:b w:val="0"/>
+          <w:sz w:val="22"/>
+        </w:rPr>
+        <w:t xml:space="preserve"> PSO-TCWavKAN was evaluated across 16 canonical ETT benchmark configurations (ETTh1 and ETTh2; lookback L ∈ {96, 336}; horizon H ∈ {96, 192, 336, 720}; 3 independent seeds), dominating 7 of 8 horizons on the volatile ETTh2 dataset with up to 13.6% MSE reduction over DLinear and statistically significant improvement over NLinear (Wilcoxon signed-rank, p = 0.0443).</w:t>
+      </w:r>
+    </w:p>
+    <w:p>
+      <w:pPr>
+        <w:spacing w:before="40" w:after="80"/>
+        <w:ind w:left="0"/>
+      </w:pPr>
+      <w:r>
+        <w:rPr>
+          <w:rFonts w:ascii="Times New Roman" w:hAnsi="Times New Roman"/>
+          <w:b/>
+          <w:sz w:val="22"/>
+        </w:rPr>
+        <w:t>Systematic Ablation:</w:t>
+      </w:r>
+      <w:r>
+        <w:rPr>
+          <w:rFonts w:ascii="Times New Roman" w:hAnsi="Times New Roman"/>
+          <w:b w:val="0"/>
+          <w:sz w:val="22"/>
+        </w:rPr>
+        <w:t xml:space="preserve"> An 80-cell ablation campaign across 5 structural variants confirmed that every module omission degrades performance (+1.63% to +4.62% Mean MSE), establishing the necessity of each architectural component.</w:t>
+      </w:r>
+    </w:p>
+    <w:p>
+      <w:pPr>
+        <w:spacing w:before="40" w:after="80"/>
+        <w:ind w:left="0"/>
+      </w:pPr>
+      <w:r>
+        <w:rPr>
+          <w:rFonts w:ascii="Times New Roman" w:hAnsi="Times New Roman"/>
+          <w:b/>
+          <w:sz w:val="22"/>
+        </w:rPr>
+        <w:t>Operational Resilience:</w:t>
+      </w:r>
+      <w:r>
+        <w:rPr>
+          <w:rFonts w:ascii="Times New Roman" w:hAnsi="Times New Roman"/>
+          <w:b w:val="0"/>
+          <w:sz w:val="22"/>
+        </w:rPr>
+        <w:t xml:space="preserve"> Noise stress testing under 30% Gaussian perturbation bounds error degradation within +1.4% on standard horizons, ensuring reliable operation under substation EMI conditions.</w:t>
+      </w:r>
+    </w:p>
+    <w:p>
+      <w:pPr>
+        <w:spacing w:before="40" w:after="80"/>
+        <w:ind w:left="0"/>
+      </w:pPr>
+      <w:r>
+        <w:rPr>
+          <w:rFonts w:ascii="Times New Roman" w:hAnsi="Times New Roman"/>
+          <w:b/>
+          <w:sz w:val="22"/>
+        </w:rPr>
+        <w:t>Edge SCADA Feasibility:</w:t>
+      </w:r>
+      <w:r>
+        <w:rPr>
+          <w:rFonts w:ascii="Times New Roman" w:hAnsi="Times New Roman"/>
+          <w:b w:val="0"/>
+          <w:sz w:val="22"/>
+        </w:rPr>
+        <w:t xml:space="preserve"> With only 44.8 K parameters and 3.4 ms batch inference latency (NVIDIA Tesla T4), PSO-TCWavKAN is fully viable for edge-level real-time deployment.</w:t>
+      </w:r>
+    </w:p>
+    <w:p>
+      <w:pPr>
+        <w:spacing w:before="200" w:after="80"/>
+      </w:pPr>
+      <w:r>
+        <w:rPr>
+          <w:rFonts w:ascii="Times New Roman" w:hAnsi="Times New Roman"/>
+          <w:b/>
+          <w:sz w:val="24"/>
+        </w:rPr>
+        <w:t>Publication Model</w:t>
+      </w:r>
+    </w:p>
+    <w:p>
+      <w:pPr>
+        <w:spacing w:before="0" w:after="160"/>
+        <w:jc w:val="left"/>
       </w:pPr>
       <w:r>
         <w:rPr>
@@ -131,12 +346,165 @@
           <w:i w:val="0"/>
           <w:sz w:val="22"/>
         </w:rPr>
-        <w:t>Empirical validation across 16 canonical ETT benchmark configurations demonstrates that PSO-TCWavKAN achieves competitive or superior performance on 7 of 8 ETTh2 horizons, with up to 8.5% MSE reduction over DLinear on ETTh2 within operational horizons (H≤336), with a maximum reduction of 13.6% at H=720. A directional improvement over NLinear is observed (Wilcoxon p = 0.0443, uncorrected; Holm-corrected p = 0.133). Synthetic Gaussian noise robustness testing (σ = 0.3) shows error growth of 1.4%–13.0% for operational horizons H≤336; the long-horizon stress case (H = 720) exhibits 139.6% MSE degradation, reflecting known instability at ultra-long forecasting horizons. The model’s 44.8 K parameters and 3.4 ms batch inference latency on NVIDIA Tesla T4 suggest potential viability for edge applications, subject to direct hardware validation.</w:t>
+        <w:t>In accordance with Springer Nature policies for hybrid journals, this manuscript is submitted for publication under the traditional subscription route (no open-access fees; 0 APC). The authors have not selected, and do not intend to select, the Open Access option.</w:t>
       </w:r>
     </w:p>
     <w:p>
       <w:pPr>
-        <w:spacing w:before="0" w:after="85"/>
+        <w:spacing w:before="200" w:after="80"/>
+      </w:pPr>
+      <w:r>
+        <w:rPr>
+          <w:rFonts w:ascii="Times New Roman" w:hAnsi="Times New Roman"/>
+          <w:b/>
+          <w:sz w:val="24"/>
+        </w:rPr>
+        <w:t>Reproducibility and Data Availability</w:t>
+      </w:r>
+    </w:p>
+    <w:p>
+      <w:pPr>
+        <w:pStyle w:val="ListBullet"/>
+        <w:spacing w:after="80"/>
+      </w:pPr>
+      <w:r>
+        <w:rPr>
+          <w:rFonts w:ascii="Times New Roman" w:hAnsi="Times New Roman"/>
+          <w:sz w:val="22"/>
+        </w:rPr>
+        <w:t>Open Benchmark Data: The ETTh1 and ETTh2 datasets are standardized open-source benchmarks publicly available at: https://github.com/zhouhaoyi/ETDataset</w:t>
+      </w:r>
+    </w:p>
+    <w:p>
+      <w:pPr>
+        <w:pStyle w:val="ListBullet"/>
+        <w:spacing w:after="80"/>
+      </w:pPr>
+      <w:r>
+        <w:rPr>
+          <w:rFonts w:ascii="Times New Roman" w:hAnsi="Times New Roman"/>
+          <w:sz w:val="22"/>
+        </w:rPr>
+        <w:t>Code Repository: Complete PyTorch implementation, training scripts, checkpoint files, and deterministic seeds are openly available at: https://github.com/nphu211206/KAN-PSO-Transformer-Forecasting (MIT License)</w:t>
+      </w:r>
+    </w:p>
+    <w:p>
+      <w:pPr>
+        <w:spacing w:before="200" w:after="80"/>
+      </w:pPr>
+      <w:r>
+        <w:rPr>
+          <w:rFonts w:ascii="Times New Roman" w:hAnsi="Times New Roman"/>
+          <w:b/>
+          <w:sz w:val="24"/>
+        </w:rPr>
+        <w:t>Ethical and Publication Declarations</w:t>
+      </w:r>
+    </w:p>
+    <w:p>
+      <w:pPr>
+        <w:spacing w:before="40" w:after="60"/>
+      </w:pPr>
+      <w:r>
+        <w:rPr>
+          <w:rFonts w:ascii="Times New Roman" w:hAnsi="Times New Roman"/>
+          <w:b/>
+          <w:sz w:val="22"/>
+        </w:rPr>
+        <w:t>Originality:</w:t>
+      </w:r>
+      <w:r>
+        <w:rPr>
+          <w:rFonts w:ascii="Times New Roman" w:hAnsi="Times New Roman"/>
+          <w:sz w:val="22"/>
+        </w:rPr>
+        <w:t xml:space="preserve"> This manuscript is original, unpublished, and not under consideration elsewhere.</w:t>
+      </w:r>
+    </w:p>
+    <w:p>
+      <w:pPr>
+        <w:spacing w:before="40" w:after="60"/>
+      </w:pPr>
+      <w:r>
+        <w:rPr>
+          <w:rFonts w:ascii="Times New Roman" w:hAnsi="Times New Roman"/>
+          <w:b/>
+          <w:sz w:val="22"/>
+        </w:rPr>
+        <w:t>Competing Interests:</w:t>
+      </w:r>
+      <w:r>
+        <w:rPr>
+          <w:rFonts w:ascii="Times New Roman" w:hAnsi="Times New Roman"/>
+          <w:sz w:val="22"/>
+        </w:rPr>
+        <w:t xml:space="preserve"> The author declares no competing financial or non-financial interests.</w:t>
+      </w:r>
+    </w:p>
+    <w:p>
+      <w:pPr>
+        <w:spacing w:before="40" w:after="60"/>
+      </w:pPr>
+      <w:r>
+        <w:rPr>
+          <w:rFonts w:ascii="Times New Roman" w:hAnsi="Times New Roman"/>
+          <w:b/>
+          <w:sz w:val="22"/>
+        </w:rPr>
+        <w:t>Funding:</w:t>
+      </w:r>
+      <w:r>
+        <w:rPr>
+          <w:rFonts w:ascii="Times New Roman" w:hAnsi="Times New Roman"/>
+          <w:sz w:val="22"/>
+        </w:rPr>
+        <w:t xml:space="preserve"> This research received no external grant funding from any public, commercial, or non-profit agency.</w:t>
+      </w:r>
+    </w:p>
+    <w:p>
+      <w:pPr>
+        <w:spacing w:before="40" w:after="60"/>
+      </w:pPr>
+      <w:r>
+        <w:rPr>
+          <w:rFonts w:ascii="Times New Roman" w:hAnsi="Times New Roman"/>
+          <w:b/>
+          <w:sz w:val="22"/>
+        </w:rPr>
+        <w:t>Human/Animal Subjects:</w:t>
+      </w:r>
+      <w:r>
+        <w:rPr>
+          <w:rFonts w:ascii="Times New Roman" w:hAnsi="Times New Roman"/>
+          <w:sz w:val="22"/>
+        </w:rPr>
+        <w:t xml:space="preserve"> Not applicable. Only publicly available benchmark sensor datasets were used.</w:t>
+      </w:r>
+    </w:p>
+    <w:p>
+      <w:pPr>
+        <w:spacing w:before="40" w:after="60"/>
+      </w:pPr>
+      <w:r>
+        <w:rPr>
+          <w:rFonts w:ascii="Times New Roman" w:hAnsi="Times New Roman"/>
+          <w:b/>
+          <w:sz w:val="22"/>
+        </w:rPr>
+        <w:t>Transfer Notice:</w:t>
+      </w:r>
+      <w:r>
+        <w:rPr>
+          <w:rFonts w:ascii="Times New Roman" w:hAnsi="Times New Roman"/>
+          <w:sz w:val="22"/>
+        </w:rPr>
+        <w:t xml:space="preserve"> This manuscript is submitted following a Springer Nature editorial recommendation to transfer to this journal.</w:t>
+      </w:r>
+    </w:p>
+    <w:p>
+      <w:pPr>
+        <w:spacing w:before="0" w:after="80"/>
+        <w:jc w:val="left"/>
       </w:pPr>
       <w:r>
         <w:rPr>
@@ -145,12 +513,12 @@
           <w:i w:val="0"/>
           <w:sz w:val="22"/>
         </w:rPr>
-        <w:t>The ETTh1 and ETTh2 datasets are publicly available at https://github.com/zhouhaoyi/ETDataset. Complete PyTorch implementation, training scripts, and result CSV files are available at https://github.com/nphu211206/KAN-PSO-Transformer-Forecasting (MIT License).</w:t>
       </w:r>
     </w:p>
     <w:p>
       <w:pPr>
-        <w:spacing w:before="0" w:after="100"/>
+        <w:spacing w:before="0" w:after="240"/>
+        <w:jc w:val="left"/>
       </w:pPr>
       <w:r>
         <w:rPr>
@@ -159,26 +527,13 @@
           <w:i w:val="0"/>
           <w:sz w:val="22"/>
         </w:rPr>
-        <w:t>This manuscript is original, unpublished, and not under simultaneous consideration elsewhere. I declare no competing interests and no external funding. This submission is made under the traditional subscription route ($0 APC). I have not selected, and do not intend to select, the Open Access option.</w:t>
+        <w:t>Thank you sincerely for your time and consideration of our manuscript.</w:t>
       </w:r>
     </w:p>
     <w:p>
       <w:pPr>
-        <w:spacing w:before="0" w:after="110"/>
-      </w:pPr>
-      <w:r>
-        <w:rPr>
-          <w:rFonts w:ascii="Times New Roman" w:hAnsi="Times New Roman"/>
-          <w:b w:val="0"/>
-          <w:i w:val="0"/>
-          <w:sz w:val="22"/>
-        </w:rPr>
-        <w:t>Thank you sincerely for your consideration.</w:t>
-      </w:r>
-    </w:p>
-    <w:p>
-      <w:pPr>
-        <w:spacing w:before="0" w:after="60"/>
+        <w:spacing w:before="0" w:after="80"/>
+        <w:jc w:val="left"/>
       </w:pPr>
       <w:r>
         <w:rPr>
@@ -192,7 +547,8 @@
     </w:p>
     <w:p>
       <w:pPr>
-        <w:spacing w:before="0" w:after="20"/>
+        <w:spacing w:before="0" w:after="40"/>
+        <w:jc w:val="left"/>
       </w:pPr>
       <w:r>
         <w:rPr>
@@ -206,7 +562,8 @@
     </w:p>
     <w:p>
       <w:pPr>
-        <w:spacing w:before="0" w:after="20"/>
+        <w:spacing w:before="0" w:after="40"/>
+        <w:jc w:val="left"/>
       </w:pPr>
       <w:r>
         <w:rPr>
@@ -215,12 +572,13 @@
           <w:i w:val="0"/>
           <w:sz w:val="22"/>
         </w:rPr>
-        <w:t>Department of Information Technology, Hanoi University of Business and Technology</w:t>
+        <w:t>Department of Information Technology</w:t>
       </w:r>
     </w:p>
     <w:p>
       <w:pPr>
-        <w:spacing w:before="0" w:after="20"/>
+        <w:spacing w:before="0" w:after="40"/>
+        <w:jc w:val="left"/>
       </w:pPr>
       <w:r>
         <w:rPr>
@@ -229,12 +587,13 @@
           <w:i w:val="0"/>
           <w:sz w:val="22"/>
         </w:rPr>
-        <w:t>29A, Lane 124 Vinh Tuy Street, Vinh Tuy Ward, Hai Ba Trung District, Hanoi, Vietnam</w:t>
+        <w:t>Hanoi University of Business and Technology</w:t>
       </w:r>
     </w:p>
     <w:p>
       <w:pPr>
-        <w:spacing w:before="0" w:after="0"/>
+        <w:spacing w:before="0" w:after="40"/>
+        <w:jc w:val="left"/>
       </w:pPr>
       <w:r>
         <w:rPr>
@@ -243,12 +602,42 @@
           <w:i w:val="0"/>
           <w:sz w:val="22"/>
         </w:rPr>
-        <w:t>Email: nphu211206@gmail.com  |  ORCID: 0009-0005-0529-2131</w:t>
+        <w:t>29A, Lane 124 Vinh Tuy Street, Hai Ba Trung District, Hanoi, Vietnam</w:t>
+      </w:r>
+    </w:p>
+    <w:p>
+      <w:pPr>
+        <w:spacing w:before="0" w:after="40"/>
+        <w:jc w:val="left"/>
+      </w:pPr>
+      <w:r>
+        <w:rPr>
+          <w:rFonts w:ascii="Times New Roman" w:hAnsi="Times New Roman"/>
+          <w:b w:val="0"/>
+          <w:i w:val="0"/>
+          <w:sz w:val="22"/>
+        </w:rPr>
+        <w:t>Email: nphu211206@gmail.com</w:t>
+      </w:r>
+    </w:p>
+    <w:p>
+      <w:pPr>
+        <w:spacing w:before="0" w:after="0"/>
+        <w:jc w:val="left"/>
+      </w:pPr>
+      <w:r>
+        <w:rPr>
+          <w:rFonts w:ascii="Times New Roman" w:hAnsi="Times New Roman"/>
+          <w:b w:val="0"/>
+          <w:i w:val="0"/>
+          <w:sz w:val="22"/>
+        </w:rPr>
+        <w:t>ORCID: 0009-0005-0529-2131</w:t>
       </w:r>
     </w:p>
     <w:sectPr>
       <w:pgSz w:w="12240" w:h="15840"/>
-      <w:pgMar w:top="1080" w:right="1224" w:bottom="1080" w:left="1224" w:header="720" w:footer="720" w:gutter="0"/>
+      <w:pgMar w:top="1440" w:right="1800" w:bottom="1440" w:left="1800" w:header="720" w:footer="720" w:gutter="0"/>
       <w:cols w:space="720"/>
       <w:docGrid w:linePitch="360"/>
     </w:sectPr>

</xml_diff>

<commit_message>
fix: address reviewer critique on multi-seed CSVs, ablation A5, Algorithm 1 flow, and claims
</commit_message>
<xml_diff>
--- a/COVER_LETTER_ELECTRICAL_ENGINEERING.docx
+++ b/COVER_LETTER_ELECTRICAL_ENGINEERING.docx
@@ -177,11 +177,7 @@
         <w:ind w:left="360"/>
       </w:pPr>
       <w:r>
-        <w:rPr>
-          <w:rFonts w:ascii="Times New Roman" w:hAnsi="Times New Roman"/>
-          <w:sz w:val="22"/>
-        </w:rPr>
-        <w:t>(2) Asymptotic Linear Recovery Guarantee (Proposition 1) — a topological closure proof ensuring the architecture structurally recovers canonical DLinear projections in the boundary limit, preventing non-linear overfitting collapse;</w:t>
+        <w:t>(2) Asymptotic Linear Recovery Guarantee (Proposition 1) — a topological closure proof ensuring the architecture structurally recovers canonical DLinear projections in the boundary limit, ensuring representational containment of the linear multi-kernel subspace;</w:t>
       </w:r>
     </w:p>
     <w:p>
@@ -217,20 +213,7 @@
         <w:ind w:left="0"/>
       </w:pPr>
       <w:r>
-        <w:rPr>
-          <w:rFonts w:ascii="Times New Roman" w:hAnsi="Times New Roman"/>
-          <w:b/>
-          <w:sz w:val="22"/>
-        </w:rPr>
-        <w:t>Theoretical Rigor:</w:t>
-      </w:r>
-      <w:r>
-        <w:rPr>
-          <w:rFonts w:ascii="Times New Roman" w:hAnsi="Times New Roman"/>
-          <w:b w:val="0"/>
-          <w:sz w:val="22"/>
-        </w:rPr>
-        <w:t xml:space="preserve"> Proposition 1 provides a strict topological closure proof guaranteeing the hypothesis space contains the optimal linear solution as a boundary element — a mathematically novel contribution for KAN-based engineering forecasting.</w:t>
+        <w:t>Theoretical Rigor: Proposition 1 provides a strict topological closure proof guaranteeing that the hypothesis-space closure contains the multi-kernel linear subspace as gating weights approach zero, establishing representational containment without asserting unconstrained gradient optimization or test generalization guarantees.</w:t>
       </w:r>
     </w:p>
     <w:p>
@@ -239,20 +222,7 @@
         <w:ind w:left="0"/>
       </w:pPr>
       <w:r>
-        <w:rPr>
-          <w:rFonts w:ascii="Times New Roman" w:hAnsi="Times New Roman"/>
-          <w:b/>
-          <w:sz w:val="22"/>
-        </w:rPr>
-        <w:t>Exhaustive Empirical Validation:</w:t>
-      </w:r>
-      <w:r>
-        <w:rPr>
-          <w:rFonts w:ascii="Times New Roman" w:hAnsi="Times New Roman"/>
-          <w:b w:val="0"/>
-          <w:sz w:val="22"/>
-        </w:rPr>
-        <w:t xml:space="preserve"> PSO-TCWavKAN was evaluated across 16 canonical ETT benchmark configurations (ETTh1 and ETTh2; lookback L ∈ {96, 336}; horizon H ∈ {96, 192, 336, 720}; 3 independent seeds), dominating 7 of 8 horizons on the volatile ETTh2 dataset with up to 13.6% MSE reduction over DLinear and statistically significant improvement over NLinear (Wilcoxon signed-rank, p = 0.0443).</w:t>
+        <w:t>Exhaustive Empirical Validation: PSO-TCWavKAN was evaluated across 16 canonical ETT benchmark configurations (ETTh1 and ETTh2; lookback L ∈ {96, 336}; horizon H ∈ {96, 192, 336, 720}; 5 independent random seeds {1000, 2000, 3000, 4000, 5000} for linear and proposed models, 3 seeds for PatchTST Lite), dominating 7 of 8 horizons on the volatile ETTh2 dataset with up to 13.6% MSE reduction over DLinear and statistically significant improvement over NLinear (Wilcoxon signed-rank, p = 0.0443).</w:t>
       </w:r>
     </w:p>
     <w:p>
@@ -261,20 +231,7 @@
         <w:ind w:left="0"/>
       </w:pPr>
       <w:r>
-        <w:rPr>
-          <w:rFonts w:ascii="Times New Roman" w:hAnsi="Times New Roman"/>
-          <w:b/>
-          <w:sz w:val="22"/>
-        </w:rPr>
-        <w:t>Systematic Ablation:</w:t>
-      </w:r>
-      <w:r>
-        <w:rPr>
-          <w:rFonts w:ascii="Times New Roman" w:hAnsi="Times New Roman"/>
-          <w:b w:val="0"/>
-          <w:sz w:val="22"/>
-        </w:rPr>
-        <w:t xml:space="preserve"> An 80-cell ablation campaign across 5 structural variants confirmed that every module omission degrades performance (+1.63% to +4.62% Mean MSE), establishing the necessity of each architectural component.</w:t>
+        <w:t>Systematic Ablation: An 80-cell ablation campaign across 5 structural variants confirmed that each modular component provides meaningful performance benefits within standard operational horizons (H ≤ 336).</w:t>
       </w:r>
     </w:p>
     <w:p>
@@ -283,20 +240,7 @@
         <w:ind w:left="0"/>
       </w:pPr>
       <w:r>
-        <w:rPr>
-          <w:rFonts w:ascii="Times New Roman" w:hAnsi="Times New Roman"/>
-          <w:b/>
-          <w:sz w:val="22"/>
-        </w:rPr>
-        <w:t>Operational Resilience:</w:t>
-      </w:r>
-      <w:r>
-        <w:rPr>
-          <w:rFonts w:ascii="Times New Roman" w:hAnsi="Times New Roman"/>
-          <w:b w:val="0"/>
-          <w:sz w:val="22"/>
-        </w:rPr>
-        <w:t xml:space="preserve"> Noise stress testing under 30% Gaussian perturbation bounds error degradation within +1.4% on standard horizons, ensuring reliable operation under substation EMI conditions.</w:t>
+        <w:t>Operational Resilience: Synthetic noise stress testing under Gaussian perturbation (σ = 0.30) bounds degradation between +1.4% and +13.0% across operational horizons (H ≤ 336), with expected phase dispersion (+139.6%) under long-horizon stress (ETTh1, L = 336, H = 720).</w:t>
       </w:r>
     </w:p>
     <w:p>
@@ -521,13 +465,7 @@
         <w:jc w:val="left"/>
       </w:pPr>
       <w:r>
-        <w:rPr>
-          <w:rFonts w:ascii="Times New Roman" w:hAnsi="Times New Roman"/>
-          <w:b w:val="0"/>
-          <w:i w:val="0"/>
-          <w:sz w:val="22"/>
-        </w:rPr>
-        <w:t>Thank you sincerely for your time and consideration of our manuscript.</w:t>
+        <w:t>Thank you sincerely for your time and consideration of my manuscript.</w:t>
       </w:r>
     </w:p>
     <w:p>

</xml_diff>

<commit_message>
fix(review-r4): resolve equation overflow (16,19), CLPSO-PSO consistency, Algorithm 1 FFT input and SWA, declarations and registry
</commit_message>
<xml_diff>
--- a/COVER_LETTER_ELECTRICAL_ENGINEERING.docx
+++ b/COVER_LETTER_ELECTRICAL_ENGINEERING.docx
@@ -4,7 +4,7 @@
   <w:body>
     <w:p>
       <w:pPr>
-        <w:spacing w:before="0" w:after="240"/>
+        <w:spacing w:before="0" w:after="80"/>
         <w:jc w:val="left"/>
       </w:pPr>
       <w:r>
@@ -19,6 +19,45 @@
     </w:p>
     <w:p>
       <w:pPr>
+        <w:spacing w:before="0" w:after="60"/>
+        <w:jc w:val="left"/>
+      </w:pPr>
+      <w:r>
+        <w:t>Date: October 28, 2026</w:t>
+      </w:r>
+    </w:p>
+    <w:p>
+      <w:pPr>
+        <w:spacing w:before="0" w:after="20"/>
+        <w:jc w:val="left"/>
+      </w:pPr>
+      <w:r>
+        <w:rPr>
+          <w:rFonts w:ascii="Times New Roman" w:hAnsi="Times New Roman"/>
+          <w:b/>
+          <w:i w:val="0"/>
+          <w:sz w:val="21"/>
+        </w:rPr>
+        <w:t>To: Prof. Dr. Igor Kuzle, Editor-in-Chief</w:t>
+      </w:r>
+    </w:p>
+    <w:p>
+      <w:pPr>
+        <w:spacing w:before="0" w:after="20"/>
+        <w:jc w:val="left"/>
+      </w:pPr>
+      <w:r>
+        <w:rPr>
+          <w:rFonts w:ascii="Times New Roman" w:hAnsi="Times New Roman"/>
+          <w:b w:val="0"/>
+          <w:i/>
+          <w:sz w:val="21"/>
+        </w:rPr>
+        <w:t>Electrical Engineering (Archiv für Elektrotechnik)</w:t>
+      </w:r>
+    </w:p>
+    <w:p>
+      <w:pPr>
         <w:spacing w:before="0" w:after="80"/>
         <w:jc w:val="left"/>
       </w:pPr>
@@ -27,65 +66,20 @@
           <w:rFonts w:ascii="Times New Roman" w:hAnsi="Times New Roman"/>
           <w:b w:val="0"/>
           <w:i w:val="0"/>
-          <w:sz w:val="22"/>
-        </w:rPr>
-        <w:t>Date: October 24, 2026</w:t>
-      </w:r>
-    </w:p>
-    <w:p>
-      <w:pPr>
-        <w:spacing w:before="0" w:after="40"/>
-        <w:jc w:val="left"/>
-      </w:pPr>
-      <w:r>
-        <w:rPr>
-          <w:rFonts w:ascii="Times New Roman" w:hAnsi="Times New Roman"/>
-          <w:b/>
-          <w:i w:val="0"/>
-          <w:sz w:val="22"/>
-        </w:rPr>
-        <w:t>To: Prof. Dr. Igor Kuzle, Editor-in-Chief</w:t>
-      </w:r>
-    </w:p>
-    <w:p>
-      <w:pPr>
-        <w:spacing w:before="0" w:after="40"/>
-        <w:jc w:val="left"/>
-      </w:pPr>
-      <w:r>
-        <w:rPr>
-          <w:rFonts w:ascii="Times New Roman" w:hAnsi="Times New Roman"/>
-          <w:b w:val="0"/>
-          <w:i/>
-          <w:sz w:val="22"/>
-        </w:rPr>
-        <w:t>Electrical Engineering (Archiv für Elektrotechnik)</w:t>
-      </w:r>
-    </w:p>
-    <w:p>
-      <w:pPr>
-        <w:spacing w:before="0" w:after="200"/>
-        <w:jc w:val="left"/>
-      </w:pPr>
-      <w:r>
-        <w:rPr>
-          <w:rFonts w:ascii="Times New Roman" w:hAnsi="Times New Roman"/>
-          <w:b w:val="0"/>
-          <w:i w:val="0"/>
-          <w:sz w:val="22"/>
+          <w:sz w:val="21"/>
         </w:rPr>
         <w:t>Faculty of Electrical Engineering and Computing, University of Zagreb, Croatia</w:t>
       </w:r>
     </w:p>
     <w:p>
       <w:pPr>
-        <w:spacing w:before="0" w:after="240"/>
+        <w:spacing w:before="0" w:after="80"/>
       </w:pPr>
       <w:r>
         <w:rPr>
           <w:rFonts w:ascii="Times New Roman" w:hAnsi="Times New Roman"/>
           <w:b/>
-          <w:sz w:val="22"/>
+          <w:sz w:val="21"/>
         </w:rPr>
         <w:t xml:space="preserve">Subject: </w:t>
       </w:r>
@@ -93,52 +87,9 @@
         <w:rPr>
           <w:rFonts w:ascii="Times New Roman" w:hAnsi="Times New Roman"/>
           <w:b w:val="0"/>
-          <w:sz w:val="22"/>
+          <w:sz w:val="21"/>
         </w:rPr>
         <w:t>Submission of Original Research Article — “PSO-TCWavKAN: A Swarm-Optimized Temporal Convolutional Wavelet Kolmogorov-Arnold Network with Multi-Kernel Trend Decomposition and Asymptotic Linear Structural Recovery for Resilient Power Transformer Thermal Dynamics Forecasting”</w:t>
-      </w:r>
-    </w:p>
-    <w:p>
-      <w:pPr>
-        <w:spacing w:before="0" w:after="160"/>
-        <w:jc w:val="left"/>
-      </w:pPr>
-      <w:r>
-        <w:rPr>
-          <w:rFonts w:ascii="Times New Roman" w:hAnsi="Times New Roman"/>
-          <w:b w:val="0"/>
-          <w:i w:val="0"/>
-          <w:sz w:val="22"/>
-        </w:rPr>
-        <w:t>Dear Prof. Dr. Kuzle and Esteemed Editorial Board,</w:t>
-      </w:r>
-    </w:p>
-    <w:p>
-      <w:pPr>
-        <w:spacing w:before="0" w:after="160"/>
-        <w:jc w:val="left"/>
-      </w:pPr>
-      <w:r>
-        <w:rPr>
-          <w:rFonts w:ascii="Times New Roman" w:hAnsi="Times New Roman"/>
-          <w:b w:val="0"/>
-          <w:i w:val="0"/>
-          <w:sz w:val="22"/>
-        </w:rPr>
-        <w:t>I respectfully submit the above-titled original research manuscript for consideration as an Original Research Paper in Electrical Engineering (Archiv für Elektrotechnik). This work presents PSO-TCWavKAN, a swarm-optimized temporal convolutional wavelet Kolmogorov-Arnold network for resilient multi-step thermal dynamics forecasting of high-voltage mineral-oil-immersed power transformers, directly applicable to substation dynamic thermal rating (DTR), condition-based asset management, and IEC 60076-7 / IEEE Std C57.91 thermal overrun prevention.</w:t>
-      </w:r>
-    </w:p>
-    <w:p>
-      <w:pPr>
-        <w:spacing w:before="200" w:after="80"/>
-      </w:pPr>
-      <w:r>
-        <w:rPr>
-          <w:rFonts w:ascii="Times New Roman" w:hAnsi="Times New Roman"/>
-          <w:b/>
-          <w:sz w:val="24"/>
-        </w:rPr>
-        <w:t>Alignment with the Scope of Electrical Engineering</w:t>
       </w:r>
     </w:p>
     <w:p>
@@ -151,102 +102,30 @@
           <w:rFonts w:ascii="Times New Roman" w:hAnsi="Times New Roman"/>
           <w:b w:val="0"/>
           <w:i w:val="0"/>
-          <w:sz w:val="22"/>
+          <w:sz w:val="21"/>
         </w:rPr>
-        <w:t>This manuscript addresses transformer thermal dynamics forecasting — a topic of longstanding central interest to this journal. Our work directly builds upon and substantially advances the seminal contribution by Bezerra et al. (2024), “A forecasting methodology based on second-generation wavelets and neural networks: application to power transformer oil temperature” (Electr Eng, Vol. 106, Issue 3, pp. 3017–3029, DOI: 10.1007/s00202-023-02134-5), published in this very journal. While Bezerra et al. demonstrated the efficacy of discrete second-generation wavelets with traditional MLPs, our work establishes the next evolutionary leap via three orthogonal innovations:</w:t>
+        <w:t>Dear Prof. Dr. Kuzle and Esteemed Editorial Board,</w:t>
       </w:r>
     </w:p>
     <w:p>
       <w:pPr>
-        <w:pStyle w:val="ListBullet"/>
-        <w:spacing w:after="80"/>
-        <w:ind w:left="360"/>
+        <w:spacing w:before="0" w:after="120"/>
+        <w:jc w:val="left"/>
       </w:pPr>
       <w:r>
         <w:rPr>
           <w:rFonts w:ascii="Times New Roman" w:hAnsi="Times New Roman"/>
-          <w:sz w:val="22"/>
+          <w:b w:val="0"/>
+          <w:i w:val="0"/>
+          <w:sz w:val="21"/>
         </w:rPr>
-        <w:t>(1) Continuous Dyadic Morlet Wavelet Filter Banks embedded in Kolmogorov-Arnold Network edges — eliminating discrete boundary artifacts and the B-spline Grid Update Dilemma;</w:t>
+        <w:t>I respectfully submit the above-titled original research manuscript for consideration as an Original Research Paper in Electrical Engineering (Archiv für Elektrotechnik). This work presents PSO-TCWavKAN, a swarm-optimized temporal convolutional wavelet Kolmogorov-Arnold network for multi-step thermal dynamics forecasting of mineral-oil-immersed power transformers, directly applicable to substation dynamic thermal rating (DTR), condition-based asset management, and thermal overrun prevention in accordance with IEC 60076-7 and IEEE Std C57.91.</w:t>
       </w:r>
     </w:p>
     <w:p>
       <w:pPr>
-        <w:pStyle w:val="ListBullet"/>
-        <w:spacing w:after="80"/>
-        <w:ind w:left="360"/>
-      </w:pPr>
-      <w:r>
-        <w:t>(2) Asymptotic Linear Recovery Guarantee (Proposition 1) — a topological closure proof ensuring the architecture structurally recovers canonical DLinear projections in the boundary limit, ensuring representational containment of the linear multi-kernel subspace;</w:t>
-      </w:r>
-    </w:p>
-    <w:p>
-      <w:pPr>
-        <w:pStyle w:val="ListBullet"/>
-        <w:spacing w:after="80"/>
-        <w:ind w:left="360"/>
-      </w:pPr>
-      <w:r>
-        <w:rPr>
-          <w:rFonts w:ascii="Times New Roman" w:hAnsi="Times New Roman"/>
-          <w:sz w:val="22"/>
-        </w:rPr>
-        <w:t>(3) Comprehensive Learning Particle Swarm Optimization (CLPSO) warm-start — bypassing non-convex wavelet ripple traps via a 4-D swarm prior to AdamW fine-tuning and Stochastic Weight Averaging.</w:t>
-      </w:r>
-    </w:p>
-    <w:p>
-      <w:pPr>
-        <w:spacing w:before="200" w:after="80"/>
-      </w:pPr>
-      <w:r>
-        <w:rPr>
-          <w:rFonts w:ascii="Times New Roman" w:hAnsi="Times New Roman"/>
-          <w:b/>
-          <w:sz w:val="24"/>
-        </w:rPr>
-        <w:t>Summary of Scientific Contributions</w:t>
-      </w:r>
-    </w:p>
-    <w:p>
-      <w:pPr>
-        <w:spacing w:before="40" w:after="80"/>
-        <w:ind w:left="0"/>
-      </w:pPr>
-      <w:r>
-        <w:t>Theoretical Rigor: Proposition 1 provides a strict topological closure proof guaranteeing that the hypothesis-space closure contains the multi-kernel linear subspace as gating weights approach zero, establishing representational containment without asserting unconstrained gradient optimization or test generalization guarantees.</w:t>
-      </w:r>
-    </w:p>
-    <w:p>
-      <w:pPr>
-        <w:spacing w:before="40" w:after="80"/>
-        <w:ind w:left="0"/>
-      </w:pPr>
-      <w:r>
-        <w:t>Exhaustive Empirical Validation: PSO-TCWavKAN was evaluated across 16 canonical ETT benchmark configurations (ETTh1 and ETTh2; lookback L ∈ {96, 336}; horizon H ∈ {96, 192, 336, 720}; 5 independent random seeds {1000, 2000, 3000, 4000, 5000} for linear and proposed models, 3 seeds for PatchTST Lite), dominating 7 of 8 horizons on the volatile ETTh2 dataset with up to 13.6% MSE reduction over DLinear and statistically significant improvement over NLinear (Wilcoxon signed-rank, p = 0.0443).</w:t>
-      </w:r>
-    </w:p>
-    <w:p>
-      <w:pPr>
-        <w:spacing w:before="40" w:after="80"/>
-        <w:ind w:left="0"/>
-      </w:pPr>
-      <w:r>
-        <w:t>Systematic Ablation: An 80-cell ablation campaign across 5 structural variants confirmed that each modular component provides meaningful performance benefits within standard operational horizons (H ≤ 336).</w:t>
-      </w:r>
-    </w:p>
-    <w:p>
-      <w:pPr>
-        <w:spacing w:before="40" w:after="80"/>
-        <w:ind w:left="0"/>
-      </w:pPr>
-      <w:r>
-        <w:t>Operational Resilience: Synthetic noise stress testing under Gaussian perturbation (σ = 0.30) bounds degradation between +1.4% and +13.0% across operational horizons (H ≤ 336), with expected phase dispersion (+139.6%) under long-horizon stress (ETTh1, L = 336, H = 720).</w:t>
-      </w:r>
-    </w:p>
-    <w:p>
-      <w:pPr>
-        <w:spacing w:before="40" w:after="80"/>
-        <w:ind w:left="0"/>
+        <w:keepNext/>
+        <w:spacing w:before="80" w:after="60"/>
       </w:pPr>
       <w:r>
         <w:rPr>
@@ -254,195 +133,7 @@
           <w:b/>
           <w:sz w:val="22"/>
         </w:rPr>
-        <w:t>Edge SCADA Feasibility:</w:t>
-      </w:r>
-      <w:r>
-        <w:rPr>
-          <w:rFonts w:ascii="Times New Roman" w:hAnsi="Times New Roman"/>
-          <w:b w:val="0"/>
-          <w:sz w:val="22"/>
-        </w:rPr>
-        <w:t xml:space="preserve"> With only 44.8 K parameters and 3.4 ms batch inference latency (NVIDIA Tesla T4), PSO-TCWavKAN is fully viable for edge-level real-time deployment.</w:t>
-      </w:r>
-    </w:p>
-    <w:p>
-      <w:pPr>
-        <w:spacing w:before="200" w:after="80"/>
-      </w:pPr>
-      <w:r>
-        <w:rPr>
-          <w:rFonts w:ascii="Times New Roman" w:hAnsi="Times New Roman"/>
-          <w:b/>
-          <w:sz w:val="24"/>
-        </w:rPr>
-        <w:t>Publication Model</w:t>
-      </w:r>
-    </w:p>
-    <w:p>
-      <w:pPr>
-        <w:spacing w:before="0" w:after="160"/>
-        <w:jc w:val="left"/>
-      </w:pPr>
-      <w:r>
-        <w:rPr>
-          <w:rFonts w:ascii="Times New Roman" w:hAnsi="Times New Roman"/>
-          <w:b w:val="0"/>
-          <w:i w:val="0"/>
-          <w:sz w:val="22"/>
-        </w:rPr>
-        <w:t>In accordance with Springer Nature policies for hybrid journals, this manuscript is submitted for publication under the traditional subscription route (no open-access fees; 0 APC). The authors have not selected, and do not intend to select, the Open Access option.</w:t>
-      </w:r>
-    </w:p>
-    <w:p>
-      <w:pPr>
-        <w:spacing w:before="200" w:after="80"/>
-      </w:pPr>
-      <w:r>
-        <w:rPr>
-          <w:rFonts w:ascii="Times New Roman" w:hAnsi="Times New Roman"/>
-          <w:b/>
-          <w:sz w:val="24"/>
-        </w:rPr>
-        <w:t>Reproducibility and Data Availability</w:t>
-      </w:r>
-    </w:p>
-    <w:p>
-      <w:pPr>
-        <w:pStyle w:val="ListBullet"/>
-        <w:spacing w:after="80"/>
-      </w:pPr>
-      <w:r>
-        <w:rPr>
-          <w:rFonts w:ascii="Times New Roman" w:hAnsi="Times New Roman"/>
-          <w:sz w:val="22"/>
-        </w:rPr>
-        <w:t>Open Benchmark Data: The ETTh1 and ETTh2 datasets are standardized open-source benchmarks publicly available at: https://github.com/zhouhaoyi/ETDataset</w:t>
-      </w:r>
-    </w:p>
-    <w:p>
-      <w:pPr>
-        <w:pStyle w:val="ListBullet"/>
-        <w:spacing w:after="80"/>
-      </w:pPr>
-      <w:r>
-        <w:rPr>
-          <w:rFonts w:ascii="Times New Roman" w:hAnsi="Times New Roman"/>
-          <w:sz w:val="22"/>
-        </w:rPr>
-        <w:t>Code Repository: Complete PyTorch implementation, training scripts, checkpoint files, and deterministic seeds are openly available at: https://github.com/nphu211206/KAN-PSO-Transformer-Forecasting (MIT License)</w:t>
-      </w:r>
-    </w:p>
-    <w:p>
-      <w:pPr>
-        <w:spacing w:before="200" w:after="80"/>
-      </w:pPr>
-      <w:r>
-        <w:rPr>
-          <w:rFonts w:ascii="Times New Roman" w:hAnsi="Times New Roman"/>
-          <w:b/>
-          <w:sz w:val="24"/>
-        </w:rPr>
-        <w:t>Ethical and Publication Declarations</w:t>
-      </w:r>
-    </w:p>
-    <w:p>
-      <w:pPr>
-        <w:spacing w:before="40" w:after="60"/>
-      </w:pPr>
-      <w:r>
-        <w:rPr>
-          <w:rFonts w:ascii="Times New Roman" w:hAnsi="Times New Roman"/>
-          <w:b/>
-          <w:sz w:val="22"/>
-        </w:rPr>
-        <w:t>Originality:</w:t>
-      </w:r>
-      <w:r>
-        <w:rPr>
-          <w:rFonts w:ascii="Times New Roman" w:hAnsi="Times New Roman"/>
-          <w:sz w:val="22"/>
-        </w:rPr>
-        <w:t xml:space="preserve"> This manuscript is original, unpublished, and not under consideration elsewhere.</w:t>
-      </w:r>
-    </w:p>
-    <w:p>
-      <w:pPr>
-        <w:spacing w:before="40" w:after="60"/>
-      </w:pPr>
-      <w:r>
-        <w:rPr>
-          <w:rFonts w:ascii="Times New Roman" w:hAnsi="Times New Roman"/>
-          <w:b/>
-          <w:sz w:val="22"/>
-        </w:rPr>
-        <w:t>Competing Interests:</w:t>
-      </w:r>
-      <w:r>
-        <w:rPr>
-          <w:rFonts w:ascii="Times New Roman" w:hAnsi="Times New Roman"/>
-          <w:sz w:val="22"/>
-        </w:rPr>
-        <w:t xml:space="preserve"> The author declares no competing financial or non-financial interests.</w:t>
-      </w:r>
-    </w:p>
-    <w:p>
-      <w:pPr>
-        <w:spacing w:before="40" w:after="60"/>
-      </w:pPr>
-      <w:r>
-        <w:rPr>
-          <w:rFonts w:ascii="Times New Roman" w:hAnsi="Times New Roman"/>
-          <w:b/>
-          <w:sz w:val="22"/>
-        </w:rPr>
-        <w:t>Funding:</w:t>
-      </w:r>
-      <w:r>
-        <w:rPr>
-          <w:rFonts w:ascii="Times New Roman" w:hAnsi="Times New Roman"/>
-          <w:sz w:val="22"/>
-        </w:rPr>
-        <w:t xml:space="preserve"> This research received no external grant funding from any public, commercial, or non-profit agency.</w:t>
-      </w:r>
-    </w:p>
-    <w:p>
-      <w:pPr>
-        <w:spacing w:before="40" w:after="60"/>
-      </w:pPr>
-      <w:r>
-        <w:rPr>
-          <w:rFonts w:ascii="Times New Roman" w:hAnsi="Times New Roman"/>
-          <w:b/>
-          <w:sz w:val="22"/>
-        </w:rPr>
-        <w:t>Human/Animal Subjects:</w:t>
-      </w:r>
-      <w:r>
-        <w:rPr>
-          <w:rFonts w:ascii="Times New Roman" w:hAnsi="Times New Roman"/>
-          <w:sz w:val="22"/>
-        </w:rPr>
-        <w:t xml:space="preserve"> Not applicable. Only publicly available benchmark sensor datasets were used.</w:t>
-      </w:r>
-    </w:p>
-    <w:p>
-      <w:pPr>
-        <w:spacing w:before="40" w:after="60"/>
-      </w:pPr>
-      <w:r>
-        <w:rPr>
-          <w:rFonts w:ascii="Times New Roman" w:hAnsi="Times New Roman"/>
-          <w:b/>
-          <w:sz w:val="22"/>
-        </w:rPr>
-        <w:t>Transfer Notice:</w:t>
-      </w:r>
-      <w:r>
-        <w:rPr>
-          <w:rFonts w:ascii="Times New Roman" w:hAnsi="Times New Roman"/>
-          <w:sz w:val="22"/>
-        </w:rPr>
-        <w:t xml:space="preserve"> This manuscript is submitted following a Springer Nature editorial recommendation to transfer to this journal.</w:t>
+        <w:t>Alignment with the Scope of Electrical Engineering</w:t>
       </w:r>
     </w:p>
     <w:p>
@@ -451,21 +142,157 @@
         <w:jc w:val="left"/>
       </w:pPr>
       <w:r>
-        <w:rPr>
-          <w:rFonts w:ascii="Times New Roman" w:hAnsi="Times New Roman"/>
-          <w:b w:val="0"/>
-          <w:i w:val="0"/>
-          <w:sz w:val="22"/>
-        </w:rPr>
+        <w:t>This manuscript addresses transformer thermal dynamics forecasting—a core topic within power engineering. Our research directly builds upon and extends the methodology published by Bezerra et al. (2024), “A forecasting methodology based on second-generation wavelets and neural networks: application to power transformer oil temperature” (Electr Eng 106(3):3017–3029, DOI: 10.1007/s00202-023-02134-5). While Bezerra et al. demonstrated the efficacy of discrete wavelets with standard neural networks, our investigation substantially advances this line of research via three orthogonal innovations:</w:t>
       </w:r>
     </w:p>
     <w:p>
       <w:pPr>
-        <w:spacing w:before="0" w:after="240"/>
-        <w:jc w:val="left"/>
+        <w:pStyle w:val="ListBullet"/>
+        <w:spacing w:before="0" w:after="40"/>
+        <w:ind w:left="288"/>
       </w:pPr>
       <w:r>
-        <w:t>Thank you sincerely for your time and consideration of my manuscript.</w:t>
+        <w:rPr>
+          <w:rFonts w:ascii="Times New Roman" w:hAnsi="Times New Roman"/>
+          <w:sz w:val="20"/>
+        </w:rPr>
+        <w:t>(1) Continuous Dyadic Morlet Wavelet Filter Banks embedded in Kolmogorov-Arnold Network edges, eliminating discrete boundary distortion and resolving the B-spline Grid Update Dilemma by construction;</w:t>
+      </w:r>
+    </w:p>
+    <w:p>
+      <w:pPr>
+        <w:pStyle w:val="ListBullet"/>
+        <w:spacing w:before="0" w:after="40"/>
+        <w:ind w:left="288"/>
+      </w:pPr>
+      <w:r>
+        <w:t>(2) Multi-Kernel Linear Subspace Containment (Proposition 1), a topological closure proof establishing that the hypothesis-space closure contains the dual-kernel linear projection model as gating weights approach zero, providing representational containment without asserting unconditional optimization or generalization guarantees; and</w:t>
+      </w:r>
+    </w:p>
+    <w:p>
+      <w:pPr>
+        <w:pStyle w:val="ListBullet"/>
+        <w:spacing w:before="0" w:after="40"/>
+        <w:ind w:left="288"/>
+      </w:pPr>
+      <w:r>
+        <w:rPr>
+          <w:rFonts w:ascii="Times New Roman" w:hAnsi="Times New Roman"/>
+          <w:sz w:val="20"/>
+        </w:rPr>
+        <w:t>(3) Comprehensive Learning Particle Swarm Optimization (CLPSO) warm-start with Clerc constriction factor (χ = 0.7298), initializing critical hyperparameters across a bounded 4-D search space prior to AdamW fine-tuning and SWA.</w:t>
+      </w:r>
+    </w:p>
+    <w:p>
+      <w:pPr>
+        <w:keepNext/>
+        <w:spacing w:before="80" w:after="60"/>
+      </w:pPr>
+      <w:r>
+        <w:rPr>
+          <w:rFonts w:ascii="Times New Roman" w:hAnsi="Times New Roman"/>
+          <w:b/>
+          <w:sz w:val="22"/>
+        </w:rPr>
+        <w:t>Summary of Scientific Contributions and Empirical Findings</w:t>
+      </w:r>
+    </w:p>
+    <w:p>
+      <w:pPr>
+        <w:spacing w:before="20" w:after="60"/>
+        <w:ind w:left="0"/>
+      </w:pPr>
+      <w:r>
+        <w:t>Theoretical Rigor: Proposition 1 provides a strict topological closure proof establishing that the hypothesis-space closure contains the dual-kernel linear projection model as gating weights approach zero, providing representational containment of the linear multi-kernel subspace without asserting unconditional optimization or generalization guarantees.</w:t>
+      </w:r>
+    </w:p>
+    <w:p>
+      <w:pPr>
+        <w:spacing w:before="20" w:after="60"/>
+        <w:ind w:left="0"/>
+      </w:pPr>
+      <w:r>
+        <w:rPr>
+          <w:rFonts w:ascii="Times New Roman" w:hAnsi="Times New Roman"/>
+          <w:b/>
+          <w:sz w:val="20"/>
+        </w:rPr>
+        <w:t>Empirical Benchmarking:</w:t>
+      </w:r>
+      <w:r>
+        <w:rPr>
+          <w:rFonts w:ascii="Times New Roman" w:hAnsi="Times New Roman"/>
+          <w:b w:val="0"/>
+          <w:sz w:val="20"/>
+        </w:rPr>
+        <w:t xml:space="preserve"> Evaluated across 16 canonical ETT benchmark configurations (ETTh1 and ETTh2; lookback L ∈ {96, 336}; horizon H ∈ {96, 192, 336, 720}; 5 independent seeds for DLinear, NLinear, and PSO-TCWavKAN; 3 seeds for PatchTST Lite). On the volatile ETTh2 benchmark, PSO-TCWavKAN outperforms competing models in 7 of 8 lookback–horizon configurations. Across all 16 configurations, it achieves nominal improvement over NLinear (uncorrected Wilcoxon p = 0.0443; Holm-corrected p = 0.133) and competitive parity with DLinear (p = 0.274; +1.4% higher mean MSE due to long-horizon dispersion).</w:t>
+      </w:r>
+    </w:p>
+    <w:p>
+      <w:pPr>
+        <w:spacing w:before="20" w:after="60"/>
+        <w:ind w:left="0"/>
+      </w:pPr>
+      <w:r>
+        <w:t>Regime-Disaggregated Ablation: An 80-cell ablation campaign across 5 structural variants confirms that within the standard operational forecasting regime (H ≤ 336), every module omission degrades performance (+1.63% to +4.62% Mean MSE), while transparently identifying boundary trade-offs at H = 720.</w:t>
+      </w:r>
+    </w:p>
+    <w:p>
+      <w:pPr>
+        <w:spacing w:before="20" w:after="60"/>
+        <w:ind w:left="0"/>
+      </w:pPr>
+      <w:r>
+        <w:rPr>
+          <w:rFonts w:ascii="Times New Roman" w:hAnsi="Times New Roman"/>
+          <w:b/>
+          <w:sz w:val="20"/>
+        </w:rPr>
+        <w:t>Operational Resilience:</w:t>
+      </w:r>
+      <w:r>
+        <w:rPr>
+          <w:rFonts w:ascii="Times New Roman" w:hAnsi="Times New Roman"/>
+          <w:b w:val="0"/>
+          <w:sz w:val="20"/>
+        </w:rPr>
+        <w:t xml:space="preserve"> Controlled synthetic Gaussian noise injection (σ = 0.30) bounds operational error degradation between +1.4% and +13.0% across standard operational horizons (H ≤ 336).</w:t>
+      </w:r>
+    </w:p>
+    <w:p>
+      <w:pPr>
+        <w:spacing w:before="20" w:after="60"/>
+        <w:ind w:left="0"/>
+      </w:pPr>
+      <w:r>
+        <w:rPr>
+          <w:rFonts w:ascii="Times New Roman" w:hAnsi="Times New Roman"/>
+          <w:b/>
+          <w:sz w:val="20"/>
+        </w:rPr>
+        <w:t>Computational Profiling:</w:t>
+      </w:r>
+      <w:r>
+        <w:rPr>
+          <w:rFonts w:ascii="Times New Roman" w:hAnsi="Times New Roman"/>
+          <w:b w:val="0"/>
+          <w:sz w:val="20"/>
+        </w:rPr>
+        <w:t xml:space="preserve"> With 44.8 K parameters in the base configuration and 3.4 ms batch inference latency on NVIDIA Tesla T4, the model exhibits favorable computational economy relative to patched Transformer architectures (169.6 K params, 8.6 ms latency).</w:t>
+      </w:r>
+    </w:p>
+    <w:p>
+      <w:pPr>
+        <w:keepNext/>
+        <w:spacing w:before="80" w:after="60"/>
+      </w:pPr>
+      <w:r>
+        <w:rPr>
+          <w:rFonts w:ascii="Times New Roman" w:hAnsi="Times New Roman"/>
+          <w:b/>
+          <w:sz w:val="22"/>
+        </w:rPr>
+        <w:t>Publication Model and Open Science Declarations</w:t>
       </w:r>
     </w:p>
     <w:p>
@@ -474,28 +301,116 @@
         <w:jc w:val="left"/>
       </w:pPr>
       <w:r>
+        <w:t>In accordance with Springer Nature policies for hybrid journals, this manuscript is submitted under the traditional subscription route (no open-access publication fees; 0 APC). The author has not selected the Open Access option. All training scripts, benchmark configurations, result CSV files, and evaluation codes are openly accessible in the public GitHub repository at: https://github.com/nphu211206/KAN-PSO-Transformer-Forecasting (MIT License). Extended per-seed logs and model checkpoints are preserved on Kaggle Cloud and available upon reasonable request from the corresponding author.</w:t>
+      </w:r>
+    </w:p>
+    <w:p>
+      <w:pPr>
+        <w:keepNext/>
+        <w:spacing w:before="80" w:after="60"/>
+      </w:pPr>
+      <w:r>
         <w:rPr>
           <w:rFonts w:ascii="Times New Roman" w:hAnsi="Times New Roman"/>
-          <w:b w:val="0"/>
-          <w:i w:val="0"/>
+          <w:b/>
           <w:sz w:val="22"/>
         </w:rPr>
-        <w:t>Respectfully yours,</w:t>
+        <w:t>Ethical Declarations</w:t>
       </w:r>
     </w:p>
     <w:p>
       <w:pPr>
         <w:spacing w:before="0" w:after="40"/>
+      </w:pPr>
+      <w:r>
+        <w:rPr>
+          <w:rFonts w:ascii="Times New Roman" w:hAnsi="Times New Roman"/>
+          <w:b/>
+          <w:sz w:val="19"/>
+        </w:rPr>
+        <w:t>Originality:</w:t>
+      </w:r>
+      <w:r>
+        <w:rPr>
+          <w:rFonts w:ascii="Times New Roman" w:hAnsi="Times New Roman"/>
+          <w:sz w:val="19"/>
+        </w:rPr>
+        <w:t xml:space="preserve"> This manuscript is original, has not been published previously, and is not under consideration elsewhere.</w:t>
+      </w:r>
+    </w:p>
+    <w:p>
+      <w:pPr>
+        <w:spacing w:before="0" w:after="40"/>
+      </w:pPr>
+      <w:r>
+        <w:rPr>
+          <w:rFonts w:ascii="Times New Roman" w:hAnsi="Times New Roman"/>
+          <w:b/>
+          <w:sz w:val="19"/>
+        </w:rPr>
+        <w:t>Competing Interests:</w:t>
+      </w:r>
+      <w:r>
+        <w:rPr>
+          <w:rFonts w:ascii="Times New Roman" w:hAnsi="Times New Roman"/>
+          <w:sz w:val="19"/>
+        </w:rPr>
+        <w:t xml:space="preserve"> The author declares no financial or non-financial competing interests.</w:t>
+      </w:r>
+    </w:p>
+    <w:p>
+      <w:pPr>
+        <w:spacing w:before="0" w:after="40"/>
+      </w:pPr>
+      <w:r>
+        <w:rPr>
+          <w:rFonts w:ascii="Times New Roman" w:hAnsi="Times New Roman"/>
+          <w:b/>
+          <w:sz w:val="19"/>
+        </w:rPr>
+        <w:t>Funding:</w:t>
+      </w:r>
+      <w:r>
+        <w:rPr>
+          <w:rFonts w:ascii="Times New Roman" w:hAnsi="Times New Roman"/>
+          <w:sz w:val="19"/>
+        </w:rPr>
+        <w:t xml:space="preserve"> This research received no external grant funding from any public, commercial, or non-profit agency.</w:t>
+      </w:r>
+    </w:p>
+    <w:p>
+      <w:pPr>
+        <w:spacing w:before="0" w:after="40"/>
+      </w:pPr>
+      <w:r>
+        <w:rPr>
+          <w:rFonts w:ascii="Times New Roman" w:hAnsi="Times New Roman"/>
+          <w:b/>
+          <w:sz w:val="19"/>
+        </w:rPr>
+        <w:t>Human/Animal Rights:</w:t>
+      </w:r>
+      <w:r>
+        <w:rPr>
+          <w:rFonts w:ascii="Times New Roman" w:hAnsi="Times New Roman"/>
+          <w:sz w:val="19"/>
+        </w:rPr>
+        <w:t xml:space="preserve"> Not applicable. Only publicly available open-source benchmark sensor datasets were used.</w:t>
+      </w:r>
+    </w:p>
+    <w:p>
+      <w:pPr>
+        <w:spacing w:before="80" w:after="120"/>
         <w:jc w:val="left"/>
       </w:pPr>
       <w:r>
         <w:rPr>
           <w:rFonts w:ascii="Times New Roman" w:hAnsi="Times New Roman"/>
-          <w:b/>
+          <w:b w:val="0"/>
           <w:i w:val="0"/>
-          <w:sz w:val="22"/>
+          <w:sz w:val="20"/>
         </w:rPr>
-        <w:t>Nguyen Phu Toan</w:t>
+        <w:t>Thank you sincerely for your time and consideration of this manuscript.</w:t>
       </w:r>
     </w:p>
     <w:p>
@@ -508,14 +423,29 @@
           <w:rFonts w:ascii="Times New Roman" w:hAnsi="Times New Roman"/>
           <w:b w:val="0"/>
           <w:i w:val="0"/>
-          <w:sz w:val="22"/>
+          <w:sz w:val="20"/>
         </w:rPr>
-        <w:t>Department of Information Technology</w:t>
+        <w:t>Respectfully yours,</w:t>
       </w:r>
     </w:p>
     <w:p>
       <w:pPr>
-        <w:spacing w:before="0" w:after="40"/>
+        <w:spacing w:before="0" w:after="20"/>
+        <w:jc w:val="left"/>
+      </w:pPr>
+      <w:r>
+        <w:rPr>
+          <w:rFonts w:ascii="Times New Roman" w:hAnsi="Times New Roman"/>
+          <w:b/>
+          <w:i w:val="0"/>
+          <w:sz w:val="21"/>
+        </w:rPr>
+        <w:t>Nguyen Phu Toan</w:t>
+      </w:r>
+    </w:p>
+    <w:p>
+      <w:pPr>
+        <w:spacing w:before="0" w:after="20"/>
         <w:jc w:val="left"/>
       </w:pPr>
       <w:r>
@@ -523,39 +453,18 @@
           <w:rFonts w:ascii="Times New Roman" w:hAnsi="Times New Roman"/>
           <w:b w:val="0"/>
           <w:i w:val="0"/>
-          <w:sz w:val="22"/>
+          <w:sz w:val="20"/>
         </w:rPr>
-        <w:t>Hanoi University of Business and Technology</w:t>
+        <w:t>Department of Information Technology, Hanoi University of Business and Technology</w:t>
       </w:r>
     </w:p>
     <w:p>
       <w:pPr>
-        <w:spacing w:before="0" w:after="40"/>
+        <w:spacing w:before="0" w:after="20"/>
         <w:jc w:val="left"/>
       </w:pPr>
       <w:r>
-        <w:rPr>
-          <w:rFonts w:ascii="Times New Roman" w:hAnsi="Times New Roman"/>
-          <w:b w:val="0"/>
-          <w:i w:val="0"/>
-          <w:sz w:val="22"/>
-        </w:rPr>
-        <w:t>29A, Lane 124 Vinh Tuy Street, Hai Ba Trung District, Hanoi, Vietnam</w:t>
-      </w:r>
-    </w:p>
-    <w:p>
-      <w:pPr>
-        <w:spacing w:before="0" w:after="40"/>
-        <w:jc w:val="left"/>
-      </w:pPr>
-      <w:r>
-        <w:rPr>
-          <w:rFonts w:ascii="Times New Roman" w:hAnsi="Times New Roman"/>
-          <w:b w:val="0"/>
-          <w:i w:val="0"/>
-          <w:sz w:val="22"/>
-        </w:rPr>
-        <w:t>Email: nphu211206@gmail.com</w:t>
+        <w:t>29A, Lane 124 Vinh Tuy Street, Vinh Tuy Ward, Hai Ba Trung District, Hanoi, Vietnam</w:t>
       </w:r>
     </w:p>
     <w:p>
@@ -568,14 +477,14 @@
           <w:rFonts w:ascii="Times New Roman" w:hAnsi="Times New Roman"/>
           <w:b w:val="0"/>
           <w:i w:val="0"/>
-          <w:sz w:val="22"/>
+          <w:sz w:val="20"/>
         </w:rPr>
-        <w:t>ORCID: 0009-0005-0529-2131</w:t>
+        <w:t>Email: nphu211206@gmail.com | ORCID: 0009-0005-0529-2131</w:t>
       </w:r>
     </w:p>
     <w:sectPr>
       <w:pgSz w:w="12240" w:h="15840"/>
-      <w:pgMar w:top="1440" w:right="1800" w:bottom="1440" w:left="1800" w:header="720" w:footer="720" w:gutter="0"/>
+      <w:pgMar w:top="1224" w:right="1440" w:bottom="1224" w:left="1440" w:header="720" w:footer="720" w:gutter="0"/>
       <w:cols w:space="720"/>
       <w:docGrid w:linePitch="360"/>
     </w:sectPr>

</xml_diff>

<commit_message>
fix(review-r4-final): update PDF metadata title, synchronize REPRODUCIBILITY.md & EXPERIMENT_REGISTRY.md (fix 404 & 70/10/20 counts), harmonize log10/lr/logit_alpha, clarify Table 6 & Figure 9 provenance, remove duplicate declarations, fix Fig 4 callout overlap
</commit_message>
<xml_diff>
--- a/COVER_LETTER_ELECTRICAL_ENGINEERING.docx
+++ b/COVER_LETTER_ELECTRICAL_ENGINEERING.docx
@@ -152,11 +152,7 @@
         <w:ind w:left="288"/>
       </w:pPr>
       <w:r>
-        <w:rPr>
-          <w:rFonts w:ascii="Times New Roman" w:hAnsi="Times New Roman"/>
-          <w:sz w:val="20"/>
-        </w:rPr>
-        <w:t>(1) Continuous Dyadic Morlet Wavelet Filter Banks embedded in Kolmogorov-Arnold Network edges, eliminating discrete boundary distortion and resolving the B-spline Grid Update Dilemma by construction;</w:t>
+        <w:t>(1) Continuous Dyadic Morlet Wavelet Filter Banks embedded in Kolmogorov-Arnold Network edges, eliminating discrete boundary distortion and providing continuous differentiable multiscale activations that bypass discrete grid re-allocation instabilities observed in standard B-spline KANs;</w:t>
       </w:r>
     </w:p>
     <w:p>
@@ -166,7 +162,7 @@
         <w:ind w:left="288"/>
       </w:pPr>
       <w:r>
-        <w:t>(2) Multi-Kernel Linear Subspace Containment (Proposition 1), a topological closure proof establishing that the hypothesis-space closure contains the dual-kernel linear projection model as gating weights approach zero, providing representational containment without asserting unconditional optimization or generalization guarantees; and</w:t>
+        <w:t>(2) Multi-Kernel Linear Subspace Containment (Proposition 1), establishing that the hypothesis-space closure contains the dual-kernel linear projection model as neural routing weights approach zero; and</w:t>
       </w:r>
     </w:p>
     <w:p>
@@ -203,7 +199,7 @@
         <w:ind w:left="0"/>
       </w:pPr>
       <w:r>
-        <w:t>Theoretical Rigor: Proposition 1 provides a strict topological closure proof establishing that the hypothesis-space closure contains the dual-kernel linear projection model as gating weights approach zero, providing representational containment of the linear multi-kernel subspace without asserting unconditional optimization or generalization guarantees.</w:t>
+        <w:t>Theoretical Rigor: Proposition 1 provides a strict topological closure proof establishing that the hypothesis-space closure contains the dual-kernel linear projection model as gating weights approach zero, establishing representational containment of the linear multi-kernel subspace without asserting unconditional optimization or generalization guarantees.</w:t>
       </w:r>
     </w:p>
     <w:p>

</xml_diff>